<commit_message>
Sync portfolio from CP Product Advisory
</commit_message>
<xml_diff>
--- a/docs/resume/clinton-pracher-platform-data-ai-resume.docx
+++ b/docs/resume/clinton-pracher-platform-data-ai-resume.docx
@@ -581,7 +581,7 @@
           <w:sz w:val="18"/>
           <w:szCs w:val="18"/>
         </w:rPr>
-        <w:t>Builds agentic orchestration and AI control-plane capabilities that enterprises can trust: routing work across agents and tools, ownership models, evaluation and trust thresholds, and human approval gates on production AI workflows. In practice today: an Operator Control Plane with 65 skills and 28 governed automations running as live agentic orchestration and control-plane infrastructure, not a slide deck.</w:t>
+        <w:t>Builds agentic orchestration and AI control-plane capabilities that enterprises can trust: routing work across agents and tools, ownership models, evaluation and trust thresholds, and human approval gates on production AI workflows. In practice today: an Operator Control Plane with 32 skills, 39 governed automations, and 49 scheduled tasks running as live agentic orchestration and control-plane infrastructure, not a slide deck.</w:t>
       </w:r>
     </w:p>
     <w:p>
@@ -1044,27 +1044,7 @@
           <w:sz w:val="18"/>
           <w:szCs w:val="18"/>
         </w:rPr>
-        <w:t>FOUNDER &amp; PRINCIPAL ADVISOR</w:t>
-      </w:r>
-      <w:r>
-        <w:rPr>
-          <w:rStyle w:val="span"/>
-          <w:rFonts w:ascii="Century Gothic" w:eastAsia="Century Gothic" w:hAnsi="Century Gothic" w:cs="Century Gothic"/>
-          <w:color w:val="231F20"/>
-          <w:sz w:val="18"/>
-          <w:szCs w:val="18"/>
-        </w:rPr>
-        <w:t xml:space="preserve"> | 7/2025 - PRESENT</w:t>
-      </w:r>
-      <w:r>
-        <w:rPr>
-          <w:rStyle w:val="singlecolumnspanpaddedlinenth-child1"/>
-          <w:rFonts w:ascii="Century Gothic" w:eastAsia="Century Gothic" w:hAnsi="Century Gothic" w:cs="Century Gothic"/>
-          <w:color w:val="231F20"/>
-          <w:sz w:val="18"/>
-          <w:szCs w:val="18"/>
-        </w:rPr>
-        <w:t xml:space="preserve"> </w:t>
+        <w:t>PRODUCT DIRECTOR, AI &amp; DATA PLATFORMS | 7/2025 - PRESENT</w:t>
       </w:r>
     </w:p>
     <w:p>
@@ -1091,7 +1071,7 @@
           <w:sz w:val="18"/>
           <w:szCs w:val="18"/>
         </w:rPr>
-        <w:t>CP PRODUCT ADVISORY</w:t>
+        <w:t>INDEPENDENT PRODUCT &amp; AI ADVISORY</w:t>
       </w:r>
     </w:p>
     <w:p>
@@ -1175,7 +1155,7 @@
           <w:sz w:val="18"/>
           <w:szCs w:val="18"/>
         </w:rPr>
-        <w:t>Built and operate an agentic orchestration and AI control plane (Operator Control Plane) with 65 specialized skills and 28 governed automations, using Claude and Cursor with explicit task ownership, audit trails, and human approval gates on production AI workflows</w:t>
+        <w:t>Built and operate an agentic orchestration and AI control plane (Operator Control Plane) with 32 specialized skills and 39 governed automations, using Claude and Cursor with explicit task ownership, audit trails, and human approval gates on production AI workflows</w:t>
       </w:r>
     </w:p>
     <w:p>
@@ -2900,17 +2880,17 @@
           <w:sz w:val="18"/>
           <w:szCs w:val="18"/>
         </w:rPr>
-        <w:t>Operator Control Plane (CP Product Advisory, 2025-2026):</w:t>
-      </w:r>
-      <w:r>
-        <w:rPr>
-          <w:rStyle w:val="Strong1"/>
-          <w:rFonts w:ascii="Century Gothic" w:eastAsia="Century Gothic" w:hAnsi="Century Gothic" w:cs="Century Gothic"/>
-          <w:color w:val="231F20"/>
-          <w:sz w:val="18"/>
-          <w:szCs w:val="18"/>
-        </w:rPr>
-        <w:t xml:space="preserve"> Built and operate an agentic orchestration and AI control plane with 65 specialized skills and 28 governed automations, using Claude and Cursor with explicit task ownership, audit trails, and human approval gates on production AI workflows.</w:t>
+        <w:t>Operator Control Plane (Independent Product &amp; AI Advisory, 2025-2026):</w:t>
+      </w:r>
+      <w:r>
+        <w:rPr>
+          <w:rStyle w:val="Strong1"/>
+          <w:rFonts w:ascii="Century Gothic" w:eastAsia="Century Gothic" w:hAnsi="Century Gothic" w:cs="Century Gothic"/>
+          <w:color w:val="231F20"/>
+          <w:sz w:val="18"/>
+          <w:szCs w:val="18"/>
+        </w:rPr>
+        <w:t xml:space="preserve"> Built and operate an agentic orchestration and AI control plane with 32 specialized skills and 39 governed automations, using Claude and Cursor with explicit task ownership, audit trails, and human approval gates on production AI workflows.</w:t>
       </w:r>
     </w:p>
     <w:p>

</xml_diff>